<commit_message>
docs: add screenshots to SR report (Swagger UI, health, citations, Hetzner)
</commit_message>
<xml_diff>
--- a/reports/sr/Звіт_СР_Коновалов_ПЗПІ-25-6.docx
+++ b/reports/sr/Звіт_СР_Коновалов_ПЗПІ-25-6.docx
@@ -3571,6 +3571,261 @@
     </w:p>
     <w:p>
       <w:pPr>
+        <w:spacing w:after="0" w:line="360" w:lineRule="auto"/>
+        <w:ind w:firstLine="709"/>
+        <w:jc w:val="both"/>
+      </w:pPr>
+      <w:r>
+        <w:rPr>
+          <w:rFonts w:ascii="Times New Roman" w:cs="Times New Roman" w:eastAsia="Times New Roman" w:hAnsi="Times New Roman"/>
+          <w:sz w:val="28"/>
+          <w:szCs w:val="28"/>
+        </w:rPr>
+        <w:t xml:space="preserve">Скріншоти роботи застосунку:</w:t>
+      </w:r>
+    </w:p>
+    <w:p>
+      <w:pPr>
+        <w:spacing w:after="0" w:before="120" w:line="360" w:lineRule="auto"/>
+        <w:jc w:val="center"/>
+      </w:pPr>
+      <w:r>
+        <w:drawing>
+          <wp:inline distT="0" distB="0" distL="0" distR="0">
+            <wp:extent cx="5581650" cy="2990850"/>
+            <wp:effectExtent t="0" r="0" b="0" l="0"/>
+            <wp:docPr id="1" name="" descr="" title=""/>
+            <wp:cNvGraphicFramePr>
+              <a:graphicFrameLocks xmlns:a="http://schemas.openxmlformats.org/drawingml/2006/main" noChangeAspect="1"/>
+            </wp:cNvGraphicFramePr>
+            <a:graphic xmlns:a="http://schemas.openxmlformats.org/drawingml/2006/main">
+              <a:graphicData uri="http://schemas.openxmlformats.org/drawingml/2006/picture">
+                <pic:pic xmlns:pic="http://schemas.openxmlformats.org/drawingml/2006/picture">
+                  <pic:nvPicPr>
+                    <pic:cNvPr id="0" name="" descr=""/>
+                    <pic:cNvPicPr>
+                      <a:picLocks noChangeAspect="1" noChangeArrowheads="1"/>
+                    </pic:cNvPicPr>
+                  </pic:nvPicPr>
+                  <pic:blipFill>
+                    <a:blip r:embed="rId8" cstate="none"/>
+                    <a:srcRect/>
+                    <a:stretch>
+                      <a:fillRect/>
+                    </a:stretch>
+                  </pic:blipFill>
+                  <pic:spPr bwMode="auto">
+                    <a:xfrm>
+                      <a:off x="0" y="0"/>
+                      <a:ext cx="5581650" cy="2990850"/>
+                    </a:xfrm>
+                    <a:prstGeom prst="rect">
+                      <a:avLst/>
+                    </a:prstGeom>
+                  </pic:spPr>
+                </pic:pic>
+              </a:graphicData>
+            </a:graphic>
+          </wp:inline>
+        </w:drawing>
+      </w:r>
+    </w:p>
+    <w:p>
+      <w:pPr>
+        <w:spacing w:after="120" w:before="60" w:line="360" w:lineRule="auto"/>
+        <w:jc w:val="center"/>
+      </w:pPr>
+      <w:r>
+        <w:rPr>
+          <w:rFonts w:ascii="Times New Roman" w:cs="Times New Roman" w:eastAsia="Times New Roman" w:hAnsi="Times New Roman"/>
+          <w:sz w:val="28"/>
+          <w:szCs w:val="28"/>
+        </w:rPr>
+        <w:t xml:space="preserve">Рисунок 4.1 — Swagger UI — інтерфейс документації API</w:t>
+      </w:r>
+    </w:p>
+    <w:p>
+      <w:pPr>
+        <w:spacing w:after="0" w:before="120" w:line="360" w:lineRule="auto"/>
+        <w:jc w:val="center"/>
+      </w:pPr>
+      <w:r>
+        <w:drawing>
+          <wp:inline distT="0" distB="0" distL="0" distR="0">
+            <wp:extent cx="5581650" cy="2181225"/>
+            <wp:effectExtent t="0" r="0" b="0" l="0"/>
+            <wp:docPr id="1" name="" descr="" title=""/>
+            <wp:cNvGraphicFramePr>
+              <a:graphicFrameLocks xmlns:a="http://schemas.openxmlformats.org/drawingml/2006/main" noChangeAspect="1"/>
+            </wp:cNvGraphicFramePr>
+            <a:graphic xmlns:a="http://schemas.openxmlformats.org/drawingml/2006/main">
+              <a:graphicData uri="http://schemas.openxmlformats.org/drawingml/2006/picture">
+                <pic:pic xmlns:pic="http://schemas.openxmlformats.org/drawingml/2006/picture">
+                  <pic:nvPicPr>
+                    <pic:cNvPr id="0" name="" descr=""/>
+                    <pic:cNvPicPr>
+                      <a:picLocks noChangeAspect="1" noChangeArrowheads="1"/>
+                    </pic:cNvPicPr>
+                  </pic:nvPicPr>
+                  <pic:blipFill>
+                    <a:blip r:embed="rId9" cstate="none"/>
+                    <a:srcRect/>
+                    <a:stretch>
+                      <a:fillRect/>
+                    </a:stretch>
+                  </pic:blipFill>
+                  <pic:spPr bwMode="auto">
+                    <a:xfrm>
+                      <a:off x="0" y="0"/>
+                      <a:ext cx="5581650" cy="2181225"/>
+                    </a:xfrm>
+                    <a:prstGeom prst="rect">
+                      <a:avLst/>
+                    </a:prstGeom>
+                  </pic:spPr>
+                </pic:pic>
+              </a:graphicData>
+            </a:graphic>
+          </wp:inline>
+        </w:drawing>
+      </w:r>
+    </w:p>
+    <w:p>
+      <w:pPr>
+        <w:spacing w:after="120" w:before="60" w:line="360" w:lineRule="auto"/>
+        <w:jc w:val="center"/>
+      </w:pPr>
+      <w:r>
+        <w:rPr>
+          <w:rFonts w:ascii="Times New Roman" w:cs="Times New Roman" w:eastAsia="Times New Roman" w:hAnsi="Times New Roman"/>
+          <w:sz w:val="28"/>
+          <w:szCs w:val="28"/>
+        </w:rPr>
+        <w:t xml:space="preserve">Рисунок 4.2 — Відповідь ендпоінту /health (код 200)</w:t>
+      </w:r>
+    </w:p>
+    <w:p>
+      <w:pPr>
+        <w:spacing w:after="0" w:before="120" w:line="360" w:lineRule="auto"/>
+        <w:jc w:val="center"/>
+      </w:pPr>
+      <w:r>
+        <w:drawing>
+          <wp:inline distT="0" distB="0" distL="0" distR="0">
+            <wp:extent cx="5581650" cy="2800350"/>
+            <wp:effectExtent t="0" r="0" b="0" l="0"/>
+            <wp:docPr id="1" name="" descr="" title=""/>
+            <wp:cNvGraphicFramePr>
+              <a:graphicFrameLocks xmlns:a="http://schemas.openxmlformats.org/drawingml/2006/main" noChangeAspect="1"/>
+            </wp:cNvGraphicFramePr>
+            <a:graphic xmlns:a="http://schemas.openxmlformats.org/drawingml/2006/main">
+              <a:graphicData uri="http://schemas.openxmlformats.org/drawingml/2006/picture">
+                <pic:pic xmlns:pic="http://schemas.openxmlformats.org/drawingml/2006/picture">
+                  <pic:nvPicPr>
+                    <pic:cNvPr id="0" name="" descr=""/>
+                    <pic:cNvPicPr>
+                      <a:picLocks noChangeAspect="1" noChangeArrowheads="1"/>
+                    </pic:cNvPicPr>
+                  </pic:nvPicPr>
+                  <pic:blipFill>
+                    <a:blip r:embed="rId10" cstate="none"/>
+                    <a:srcRect/>
+                    <a:stretch>
+                      <a:fillRect/>
+                    </a:stretch>
+                  </pic:blipFill>
+                  <pic:spPr bwMode="auto">
+                    <a:xfrm>
+                      <a:off x="0" y="0"/>
+                      <a:ext cx="5581650" cy="2800350"/>
+                    </a:xfrm>
+                    <a:prstGeom prst="rect">
+                      <a:avLst/>
+                    </a:prstGeom>
+                  </pic:spPr>
+                </pic:pic>
+              </a:graphicData>
+            </a:graphic>
+          </wp:inline>
+        </w:drawing>
+      </w:r>
+    </w:p>
+    <w:p>
+      <w:pPr>
+        <w:spacing w:after="120" w:before="60" w:line="360" w:lineRule="auto"/>
+        <w:jc w:val="center"/>
+      </w:pPr>
+      <w:r>
+        <w:rPr>
+          <w:rFonts w:ascii="Times New Roman" w:cs="Times New Roman" w:eastAsia="Times New Roman" w:hAnsi="Times New Roman"/>
+          <w:sz w:val="28"/>
+          <w:szCs w:val="28"/>
+        </w:rPr>
+        <w:t xml:space="preserve">Рисунок 4.3 — Відповідь ендпоінту POST /citations/generate (код 200)</w:t>
+      </w:r>
+    </w:p>
+    <w:p>
+      <w:pPr>
+        <w:spacing w:after="0" w:before="120" w:line="360" w:lineRule="auto"/>
+        <w:jc w:val="center"/>
+      </w:pPr>
+      <w:r>
+        <w:drawing>
+          <wp:inline distT="0" distB="0" distL="0" distR="0">
+            <wp:extent cx="5581650" cy="2324100"/>
+            <wp:effectExtent t="0" r="0" b="0" l="0"/>
+            <wp:docPr id="1" name="" descr="" title=""/>
+            <wp:cNvGraphicFramePr>
+              <a:graphicFrameLocks xmlns:a="http://schemas.openxmlformats.org/drawingml/2006/main" noChangeAspect="1"/>
+            </wp:cNvGraphicFramePr>
+            <a:graphic xmlns:a="http://schemas.openxmlformats.org/drawingml/2006/main">
+              <a:graphicData uri="http://schemas.openxmlformats.org/drawingml/2006/picture">
+                <pic:pic xmlns:pic="http://schemas.openxmlformats.org/drawingml/2006/picture">
+                  <pic:nvPicPr>
+                    <pic:cNvPr id="0" name="" descr=""/>
+                    <pic:cNvPicPr>
+                      <a:picLocks noChangeAspect="1" noChangeArrowheads="1"/>
+                    </pic:cNvPicPr>
+                  </pic:nvPicPr>
+                  <pic:blipFill>
+                    <a:blip r:embed="rId11" cstate="none"/>
+                    <a:srcRect/>
+                    <a:stretch>
+                      <a:fillRect/>
+                    </a:stretch>
+                  </pic:blipFill>
+                  <pic:spPr bwMode="auto">
+                    <a:xfrm>
+                      <a:off x="0" y="0"/>
+                      <a:ext cx="5581650" cy="2324100"/>
+                    </a:xfrm>
+                    <a:prstGeom prst="rect">
+                      <a:avLst/>
+                    </a:prstGeom>
+                  </pic:spPr>
+                </pic:pic>
+              </a:graphicData>
+            </a:graphic>
+          </wp:inline>
+        </w:drawing>
+      </w:r>
+    </w:p>
+    <w:p>
+      <w:pPr>
+        <w:spacing w:after="120" w:before="60" w:line="360" w:lineRule="auto"/>
+        <w:jc w:val="center"/>
+      </w:pPr>
+      <w:r>
+        <w:rPr>
+          <w:rFonts w:ascii="Times New Roman" w:cs="Times New Roman" w:eastAsia="Times New Roman" w:hAnsi="Times New Roman"/>
+          <w:sz w:val="28"/>
+          <w:szCs w:val="28"/>
+        </w:rPr>
+        <w:t xml:space="preserve">Рисунок 4.4 — Dashboard Hetzner Cloud — сервер у статусі Running</w:t>
+      </w:r>
+    </w:p>
+    <w:p>
+      <w:pPr>
         <w:pStyle w:val="Heading1"/>
         <w:keepNext/>
         <w:pageBreakBefore/>

</xml_diff>